<commit_message>
Add pre-forked multi-process mode and scaling benchmark
- server.py --workers N: sockets bound once, workers forked before threads start
- Benchmark e10: TCP echo 1.9-2.1x throughput with 6 workers; shared-socket DNS regresses
- Report: Optimisation 4 section and table, updated limitations
</commit_message>
<xml_diff>
--- a/report/CN_Project_Report.docx
+++ b/report/CN_Project_Report.docx
@@ -5915,7 +5915,7 @@
         <w:t>34 passed, 0 failed, 0 errors, 0 skipped</w:t>
       </w:r>
       <w:r>
-        <w:t xml:space="preserve"> in 11.75 s (</w:t>
+        <w:t xml:space="preserve"> in 11.79 s (</w:t>
       </w:r>
       <w:r>
         <w:rPr>
@@ -19227,17 +19227,7 @@
         <w:t>Weakness 1 – single-core ceiling.</w:t>
       </w:r>
       <w:r>
-        <w:t xml:space="preserve"> Echo throughput plateaus at 27,842–29,130 requests/s from 10 to 100 clients while server CPU is ≈93% – one saturated core. CPython’s Global Interpreter Lock lets only one thread execute Python bytecode at a time, so adding clients adds queueing delay, not capacity: p95 latency grows almost linearly (Little’s law: 100 clients / 27,842 req/s = 3.59 ms predicted mean versus 3.51 ms measured). At 400 clients throughput falls to 18,619 req/s (35% below the plateau) because 400 runnable threads add scheduling overhead. The fix would be several worker processes sharing the listening port (</w:t>
-      </w:r>
-      <w:r>
-        <w:rPr>
-          <w:rFonts w:ascii="Courier New" w:hAnsi="Courier New" w:eastAsia="Courier New"/>
-          <w:sz w:val="21"/>
-        </w:rPr>
-        <w:t>SO_REUSEPORT</w:t>
-      </w:r>
-      <w:r>
-        <w:t>) or an event-loop design; it was not implemented because it would change the thread-per-connection teaching model.</w:t>
+        <w:t xml:space="preserve"> Echo throughput plateaus at 27,842–29,130 requests/s from 10 to 100 clients while server CPU is ≈93% – one saturated core. CPython’s Global Interpreter Lock lets only one thread execute Python bytecode at a time, so adding clients adds queueing delay, not capacity: p95 latency grows almost linearly (Little’s law: 100 clients / 27,842 req/s = 3.59 ms predicted mean versus 3.51 ms measured). At 400 clients throughput falls to 18,619 req/s (35% below the plateau) because 400 runnable threads add scheduling overhead. Optimisation 4 below removes this ceiling for TCP with pre-forked worker processes.</w:t>
       </w:r>
     </w:p>
     <w:p>
@@ -20180,6 +20170,879 @@
       </w:r>
       <w:r>
         <w:t xml:space="preserve"> of attempts, not by their timing. The response time, however, falls by 4.3–6.7×. On loopback the learned RTO sits at the 5 ms floor, so the floor (not the RTT) now dominates; on a real network with tens of milliseconds of RTT the estimator would track the path instead. The trade-off is that a too-small floor causes spurious retransmissions on a path whose delay suddenly rises, which is why RFC 6298 recommends a conservative minimum on the open Internet.</w:t>
+      </w:r>
+    </w:p>
+    <w:p>
+      <w:pPr>
+        <w:jc w:val="both"/>
+      </w:pPr>
+      <w:r>
+        <w:rPr>
+          <w:b/>
+        </w:rPr>
+        <w:t>Optimisation 4 – pre-forked worker processes.</w:t>
+      </w:r>
+      <w:r>
+        <w:t xml:space="preserve"> To get past the one-core limit, </w:t>
+      </w:r>
+      <w:r>
+        <w:rPr>
+          <w:rFonts w:ascii="Courier New" w:hAnsi="Courier New" w:eastAsia="Courier New"/>
+          <w:sz w:val="21"/>
+        </w:rPr>
+        <w:t>server.py --workers N</w:t>
+      </w:r>
+      <w:r>
+        <w:t xml:space="preserve"> binds every socket once and then forks N−1 copies before any thread starts; all processes inherit the same listening sockets and the kernel hands each new connection or datagram to whichever process is waiting (the classic pre-fork model used by Apache and gunicorn). Each process has its own interpreter and GIL.</w:t>
+      </w:r>
+    </w:p>
+    <w:p>
+      <w:pPr>
+        <w:keepNext/>
+        <w:spacing w:after="60"/>
+        <w:jc w:val="center"/>
+      </w:pPr>
+      <w:r>
+        <w:rPr>
+          <w:b/>
+          <w:sz w:val="21"/>
+        </w:rPr>
+        <w:t>Table 21:</w:t>
+      </w:r>
+      <w:r>
+        <w:rPr>
+          <w:sz w:val="21"/>
+        </w:rPr>
+        <w:t xml:space="preserve"> Single process versus pre-forked workers</w:t>
+      </w:r>
+    </w:p>
+    <w:tbl>
+      <w:tblPr>
+        <w:tblStyle w:val="TableGrid"/>
+        <w:tblW w:type="auto" w:w="0"/>
+        <w:jc w:val="center"/>
+        <w:tblLayout w:type="fixed"/>
+        <w:tblLook w:firstColumn="1" w:firstRow="1" w:lastColumn="0" w:lastRow="0" w:noHBand="0" w:noVBand="1" w:val="04A0"/>
+      </w:tblPr>
+      <w:tblGrid>
+        <w:gridCol w:w="1129"/>
+        <w:gridCol w:w="1129"/>
+        <w:gridCol w:w="1129"/>
+        <w:gridCol w:w="1129"/>
+        <w:gridCol w:w="1129"/>
+        <w:gridCol w:w="1129"/>
+        <w:gridCol w:w="1129"/>
+        <w:gridCol w:w="1129"/>
+      </w:tblGrid>
+      <w:tr>
+        <w:trPr>
+          <w:tblHeader w:val="true"/>
+        </w:trPr>
+        <w:tc>
+          <w:tcPr>
+            <w:tcW w:type="dxa" w:w="1080"/>
+            <w:shd w:val="clear" w:color="auto" w:fill="D9E2F3"/>
+          </w:tcPr>
+          <w:p>
+            <w:pPr>
+              <w:spacing w:after="0"/>
+              <w:jc w:val="center"/>
+            </w:pPr>
+            <w:r/>
+            <w:r>
+              <w:rPr>
+                <w:b/>
+                <w:sz w:val="18"/>
+              </w:rPr>
+              <w:t>Worker processes</w:t>
+            </w:r>
+          </w:p>
+        </w:tc>
+        <w:tc>
+          <w:tcPr>
+            <w:tcW w:type="dxa" w:w="1296"/>
+            <w:shd w:val="clear" w:color="auto" w:fill="D9E2F3"/>
+          </w:tcPr>
+          <w:p>
+            <w:pPr>
+              <w:spacing w:after="0"/>
+              <w:jc w:val="center"/>
+            </w:pPr>
+            <w:r/>
+            <w:r>
+              <w:rPr>
+                <w:b/>
+                <w:sz w:val="18"/>
+              </w:rPr>
+              <w:t>Echo, 50 clients (req/s)</w:t>
+            </w:r>
+          </w:p>
+        </w:tc>
+        <w:tc>
+          <w:tcPr>
+            <w:tcW w:type="dxa" w:w="864"/>
+            <w:shd w:val="clear" w:color="auto" w:fill="D9E2F3"/>
+          </w:tcPr>
+          <w:p>
+            <w:pPr>
+              <w:spacing w:after="0"/>
+              <w:jc w:val="center"/>
+            </w:pPr>
+            <w:r/>
+            <w:r>
+              <w:rPr>
+                <w:b/>
+                <w:sz w:val="18"/>
+              </w:rPr>
+              <w:t>p95 (ms)</w:t>
+            </w:r>
+          </w:p>
+        </w:tc>
+        <w:tc>
+          <w:tcPr>
+            <w:tcW w:type="dxa" w:w="1296"/>
+            <w:shd w:val="clear" w:color="auto" w:fill="D9E2F3"/>
+          </w:tcPr>
+          <w:p>
+            <w:pPr>
+              <w:spacing w:after="0"/>
+              <w:jc w:val="center"/>
+            </w:pPr>
+            <w:r/>
+            <w:r>
+              <w:rPr>
+                <w:b/>
+                <w:sz w:val="18"/>
+              </w:rPr>
+              <w:t>Echo, 200 clients (req/s)</w:t>
+            </w:r>
+          </w:p>
+        </w:tc>
+        <w:tc>
+          <w:tcPr>
+            <w:tcW w:type="dxa" w:w="864"/>
+            <w:shd w:val="clear" w:color="auto" w:fill="D9E2F3"/>
+          </w:tcPr>
+          <w:p>
+            <w:pPr>
+              <w:spacing w:after="0"/>
+              <w:jc w:val="center"/>
+            </w:pPr>
+            <w:r/>
+            <w:r>
+              <w:rPr>
+                <w:b/>
+                <w:sz w:val="18"/>
+              </w:rPr>
+              <w:t>p95 (ms)</w:t>
+            </w:r>
+          </w:p>
+        </w:tc>
+        <w:tc>
+          <w:tcPr>
+            <w:tcW w:type="dxa" w:w="1296"/>
+            <w:shd w:val="clear" w:color="auto" w:fill="D9E2F3"/>
+          </w:tcPr>
+          <w:p>
+            <w:pPr>
+              <w:spacing w:after="0"/>
+              <w:jc w:val="center"/>
+            </w:pPr>
+            <w:r/>
+            <w:r>
+              <w:rPr>
+                <w:b/>
+                <w:sz w:val="18"/>
+              </w:rPr>
+              <w:t>DNS, 32 resolvers (q/s)</w:t>
+            </w:r>
+          </w:p>
+        </w:tc>
+        <w:tc>
+          <w:tcPr>
+            <w:tcW w:type="dxa" w:w="864"/>
+            <w:shd w:val="clear" w:color="auto" w:fill="D9E2F3"/>
+          </w:tcPr>
+          <w:p>
+            <w:pPr>
+              <w:spacing w:after="0"/>
+              <w:jc w:val="center"/>
+            </w:pPr>
+            <w:r/>
+            <w:r>
+              <w:rPr>
+                <w:b/>
+                <w:sz w:val="18"/>
+              </w:rPr>
+              <w:t>p95 (ms)</w:t>
+            </w:r>
+          </w:p>
+        </w:tc>
+        <w:tc>
+          <w:tcPr>
+            <w:tcW w:type="dxa" w:w="792"/>
+            <w:shd w:val="clear" w:color="auto" w:fill="D9E2F3"/>
+          </w:tcPr>
+          <w:p>
+            <w:pPr>
+              <w:spacing w:after="0"/>
+              <w:jc w:val="center"/>
+            </w:pPr>
+            <w:r/>
+            <w:r>
+              <w:rPr>
+                <w:b/>
+                <w:sz w:val="18"/>
+              </w:rPr>
+              <w:t>Errors</w:t>
+            </w:r>
+          </w:p>
+        </w:tc>
+      </w:tr>
+      <w:tr>
+        <w:tc>
+          <w:tcPr>
+            <w:tcW w:type="dxa" w:w="1080"/>
+          </w:tcPr>
+          <w:p>
+            <w:pPr>
+              <w:spacing w:after="0" w:line="240" w:lineRule="auto"/>
+              <w:jc w:val="center"/>
+            </w:pPr>
+            <w:r/>
+            <w:r>
+              <w:rPr>
+                <w:sz w:val="18"/>
+              </w:rPr>
+              <w:t>1</w:t>
+            </w:r>
+          </w:p>
+        </w:tc>
+        <w:tc>
+          <w:tcPr>
+            <w:tcW w:type="dxa" w:w="1296"/>
+          </w:tcPr>
+          <w:p>
+            <w:pPr>
+              <w:spacing w:after="0" w:line="240" w:lineRule="auto"/>
+              <w:jc w:val="center"/>
+            </w:pPr>
+            <w:r/>
+            <w:r>
+              <w:rPr>
+                <w:sz w:val="18"/>
+              </w:rPr>
+              <w:t>30,103</w:t>
+            </w:r>
+          </w:p>
+        </w:tc>
+        <w:tc>
+          <w:tcPr>
+            <w:tcW w:type="dxa" w:w="864"/>
+          </w:tcPr>
+          <w:p>
+            <w:pPr>
+              <w:spacing w:after="0" w:line="240" w:lineRule="auto"/>
+              <w:jc w:val="center"/>
+            </w:pPr>
+            <w:r/>
+            <w:r>
+              <w:rPr>
+                <w:sz w:val="18"/>
+              </w:rPr>
+              <w:t>3.17</w:t>
+            </w:r>
+          </w:p>
+        </w:tc>
+        <w:tc>
+          <w:tcPr>
+            <w:tcW w:type="dxa" w:w="1296"/>
+          </w:tcPr>
+          <w:p>
+            <w:pPr>
+              <w:spacing w:after="0" w:line="240" w:lineRule="auto"/>
+              <w:jc w:val="center"/>
+            </w:pPr>
+            <w:r/>
+            <w:r>
+              <w:rPr>
+                <w:sz w:val="18"/>
+              </w:rPr>
+              <w:t>24,349</w:t>
+            </w:r>
+          </w:p>
+        </w:tc>
+        <w:tc>
+          <w:tcPr>
+            <w:tcW w:type="dxa" w:w="864"/>
+          </w:tcPr>
+          <w:p>
+            <w:pPr>
+              <w:spacing w:after="0" w:line="240" w:lineRule="auto"/>
+              <w:jc w:val="center"/>
+            </w:pPr>
+            <w:r/>
+            <w:r>
+              <w:rPr>
+                <w:sz w:val="18"/>
+              </w:rPr>
+              <w:t>15.90</w:t>
+            </w:r>
+          </w:p>
+        </w:tc>
+        <w:tc>
+          <w:tcPr>
+            <w:tcW w:type="dxa" w:w="1296"/>
+          </w:tcPr>
+          <w:p>
+            <w:pPr>
+              <w:spacing w:after="0" w:line="240" w:lineRule="auto"/>
+              <w:jc w:val="center"/>
+            </w:pPr>
+            <w:r/>
+            <w:r>
+              <w:rPr>
+                <w:sz w:val="18"/>
+              </w:rPr>
+              <w:t>15,872</w:t>
+            </w:r>
+          </w:p>
+        </w:tc>
+        <w:tc>
+          <w:tcPr>
+            <w:tcW w:type="dxa" w:w="864"/>
+          </w:tcPr>
+          <w:p>
+            <w:pPr>
+              <w:spacing w:after="0" w:line="240" w:lineRule="auto"/>
+              <w:jc w:val="center"/>
+            </w:pPr>
+            <w:r/>
+            <w:r>
+              <w:rPr>
+                <w:sz w:val="18"/>
+              </w:rPr>
+              <w:t>2.95</w:t>
+            </w:r>
+          </w:p>
+        </w:tc>
+        <w:tc>
+          <w:tcPr>
+            <w:tcW w:type="dxa" w:w="792"/>
+          </w:tcPr>
+          <w:p>
+            <w:pPr>
+              <w:spacing w:after="0" w:line="240" w:lineRule="auto"/>
+              <w:jc w:val="center"/>
+            </w:pPr>
+            <w:r/>
+            <w:r>
+              <w:rPr>
+                <w:sz w:val="18"/>
+              </w:rPr>
+              <w:t>0</w:t>
+            </w:r>
+          </w:p>
+        </w:tc>
+      </w:tr>
+      <w:tr>
+        <w:tc>
+          <w:tcPr>
+            <w:tcW w:type="dxa" w:w="1080"/>
+          </w:tcPr>
+          <w:p>
+            <w:pPr>
+              <w:spacing w:after="0" w:line="240" w:lineRule="auto"/>
+              <w:jc w:val="center"/>
+            </w:pPr>
+            <w:r/>
+            <w:r>
+              <w:rPr>
+                <w:sz w:val="18"/>
+              </w:rPr>
+              <w:t>2</w:t>
+            </w:r>
+          </w:p>
+        </w:tc>
+        <w:tc>
+          <w:tcPr>
+            <w:tcW w:type="dxa" w:w="1296"/>
+          </w:tcPr>
+          <w:p>
+            <w:pPr>
+              <w:spacing w:after="0" w:line="240" w:lineRule="auto"/>
+              <w:jc w:val="center"/>
+            </w:pPr>
+            <w:r/>
+            <w:r>
+              <w:rPr>
+                <w:sz w:val="18"/>
+              </w:rPr>
+              <w:t>36,905</w:t>
+            </w:r>
+          </w:p>
+        </w:tc>
+        <w:tc>
+          <w:tcPr>
+            <w:tcW w:type="dxa" w:w="864"/>
+          </w:tcPr>
+          <w:p>
+            <w:pPr>
+              <w:spacing w:after="0" w:line="240" w:lineRule="auto"/>
+              <w:jc w:val="center"/>
+            </w:pPr>
+            <w:r/>
+            <w:r>
+              <w:rPr>
+                <w:sz w:val="18"/>
+              </w:rPr>
+              <w:t>2.60</w:t>
+            </w:r>
+          </w:p>
+        </w:tc>
+        <w:tc>
+          <w:tcPr>
+            <w:tcW w:type="dxa" w:w="1296"/>
+          </w:tcPr>
+          <w:p>
+            <w:pPr>
+              <w:spacing w:after="0" w:line="240" w:lineRule="auto"/>
+              <w:jc w:val="center"/>
+            </w:pPr>
+            <w:r/>
+            <w:r>
+              <w:rPr>
+                <w:sz w:val="18"/>
+              </w:rPr>
+              <w:t>34,446</w:t>
+            </w:r>
+          </w:p>
+        </w:tc>
+        <w:tc>
+          <w:tcPr>
+            <w:tcW w:type="dxa" w:w="864"/>
+          </w:tcPr>
+          <w:p>
+            <w:pPr>
+              <w:spacing w:after="0" w:line="240" w:lineRule="auto"/>
+              <w:jc w:val="center"/>
+            </w:pPr>
+            <w:r/>
+            <w:r>
+              <w:rPr>
+                <w:sz w:val="18"/>
+              </w:rPr>
+              <w:t>11.20</w:t>
+            </w:r>
+          </w:p>
+        </w:tc>
+        <w:tc>
+          <w:tcPr>
+            <w:tcW w:type="dxa" w:w="1296"/>
+          </w:tcPr>
+          <w:p>
+            <w:pPr>
+              <w:spacing w:after="0" w:line="240" w:lineRule="auto"/>
+              <w:jc w:val="center"/>
+            </w:pPr>
+            <w:r/>
+            <w:r>
+              <w:rPr>
+                <w:sz w:val="18"/>
+              </w:rPr>
+              <w:t>8,177</w:t>
+            </w:r>
+          </w:p>
+        </w:tc>
+        <w:tc>
+          <w:tcPr>
+            <w:tcW w:type="dxa" w:w="864"/>
+          </w:tcPr>
+          <w:p>
+            <w:pPr>
+              <w:spacing w:after="0" w:line="240" w:lineRule="auto"/>
+              <w:jc w:val="center"/>
+            </w:pPr>
+            <w:r/>
+            <w:r>
+              <w:rPr>
+                <w:sz w:val="18"/>
+              </w:rPr>
+              <w:t>16.25</w:t>
+            </w:r>
+          </w:p>
+        </w:tc>
+        <w:tc>
+          <w:tcPr>
+            <w:tcW w:type="dxa" w:w="792"/>
+          </w:tcPr>
+          <w:p>
+            <w:pPr>
+              <w:spacing w:after="0" w:line="240" w:lineRule="auto"/>
+              <w:jc w:val="center"/>
+            </w:pPr>
+            <w:r/>
+            <w:r>
+              <w:rPr>
+                <w:sz w:val="18"/>
+              </w:rPr>
+              <w:t>0</w:t>
+            </w:r>
+          </w:p>
+        </w:tc>
+      </w:tr>
+      <w:tr>
+        <w:tc>
+          <w:tcPr>
+            <w:tcW w:type="dxa" w:w="1080"/>
+          </w:tcPr>
+          <w:p>
+            <w:pPr>
+              <w:spacing w:after="0" w:line="240" w:lineRule="auto"/>
+              <w:jc w:val="center"/>
+            </w:pPr>
+            <w:r/>
+            <w:r>
+              <w:rPr>
+                <w:sz w:val="18"/>
+              </w:rPr>
+              <w:t>4</w:t>
+            </w:r>
+          </w:p>
+        </w:tc>
+        <w:tc>
+          <w:tcPr>
+            <w:tcW w:type="dxa" w:w="1296"/>
+          </w:tcPr>
+          <w:p>
+            <w:pPr>
+              <w:spacing w:after="0" w:line="240" w:lineRule="auto"/>
+              <w:jc w:val="center"/>
+            </w:pPr>
+            <w:r/>
+            <w:r>
+              <w:rPr>
+                <w:sz w:val="18"/>
+              </w:rPr>
+              <w:t>51,805</w:t>
+            </w:r>
+          </w:p>
+        </w:tc>
+        <w:tc>
+          <w:tcPr>
+            <w:tcW w:type="dxa" w:w="864"/>
+          </w:tcPr>
+          <w:p>
+            <w:pPr>
+              <w:spacing w:after="0" w:line="240" w:lineRule="auto"/>
+              <w:jc w:val="center"/>
+            </w:pPr>
+            <w:r/>
+            <w:r>
+              <w:rPr>
+                <w:sz w:val="18"/>
+              </w:rPr>
+              <w:t>1.73</w:t>
+            </w:r>
+          </w:p>
+        </w:tc>
+        <w:tc>
+          <w:tcPr>
+            <w:tcW w:type="dxa" w:w="1296"/>
+          </w:tcPr>
+          <w:p>
+            <w:pPr>
+              <w:spacing w:after="0" w:line="240" w:lineRule="auto"/>
+              <w:jc w:val="center"/>
+            </w:pPr>
+            <w:r/>
+            <w:r>
+              <w:rPr>
+                <w:sz w:val="18"/>
+              </w:rPr>
+              <w:t>45,939</w:t>
+            </w:r>
+          </w:p>
+        </w:tc>
+        <w:tc>
+          <w:tcPr>
+            <w:tcW w:type="dxa" w:w="864"/>
+          </w:tcPr>
+          <w:p>
+            <w:pPr>
+              <w:spacing w:after="0" w:line="240" w:lineRule="auto"/>
+              <w:jc w:val="center"/>
+            </w:pPr>
+            <w:r/>
+            <w:r>
+              <w:rPr>
+                <w:sz w:val="18"/>
+              </w:rPr>
+              <w:t>9.57</w:t>
+            </w:r>
+          </w:p>
+        </w:tc>
+        <w:tc>
+          <w:tcPr>
+            <w:tcW w:type="dxa" w:w="1296"/>
+          </w:tcPr>
+          <w:p>
+            <w:pPr>
+              <w:spacing w:after="0" w:line="240" w:lineRule="auto"/>
+              <w:jc w:val="center"/>
+            </w:pPr>
+            <w:r/>
+            <w:r>
+              <w:rPr>
+                <w:sz w:val="18"/>
+              </w:rPr>
+              <w:t>9,872</w:t>
+            </w:r>
+          </w:p>
+        </w:tc>
+        <w:tc>
+          <w:tcPr>
+            <w:tcW w:type="dxa" w:w="864"/>
+          </w:tcPr>
+          <w:p>
+            <w:pPr>
+              <w:spacing w:after="0" w:line="240" w:lineRule="auto"/>
+              <w:jc w:val="center"/>
+            </w:pPr>
+            <w:r/>
+            <w:r>
+              <w:rPr>
+                <w:sz w:val="18"/>
+              </w:rPr>
+              <w:t>10.07</w:t>
+            </w:r>
+          </w:p>
+        </w:tc>
+        <w:tc>
+          <w:tcPr>
+            <w:tcW w:type="dxa" w:w="792"/>
+          </w:tcPr>
+          <w:p>
+            <w:pPr>
+              <w:spacing w:after="0" w:line="240" w:lineRule="auto"/>
+              <w:jc w:val="center"/>
+            </w:pPr>
+            <w:r/>
+            <w:r>
+              <w:rPr>
+                <w:sz w:val="18"/>
+              </w:rPr>
+              <w:t>0</w:t>
+            </w:r>
+          </w:p>
+        </w:tc>
+      </w:tr>
+      <w:tr>
+        <w:tc>
+          <w:tcPr>
+            <w:tcW w:type="dxa" w:w="1080"/>
+          </w:tcPr>
+          <w:p>
+            <w:pPr>
+              <w:spacing w:after="0" w:line="240" w:lineRule="auto"/>
+              <w:jc w:val="center"/>
+            </w:pPr>
+            <w:r/>
+            <w:r>
+              <w:rPr>
+                <w:sz w:val="18"/>
+              </w:rPr>
+              <w:t>6</w:t>
+            </w:r>
+          </w:p>
+        </w:tc>
+        <w:tc>
+          <w:tcPr>
+            <w:tcW w:type="dxa" w:w="1296"/>
+          </w:tcPr>
+          <w:p>
+            <w:pPr>
+              <w:spacing w:after="0" w:line="240" w:lineRule="auto"/>
+              <w:jc w:val="center"/>
+            </w:pPr>
+            <w:r/>
+            <w:r>
+              <w:rPr>
+                <w:sz w:val="18"/>
+              </w:rPr>
+              <w:t>57,474</w:t>
+            </w:r>
+          </w:p>
+        </w:tc>
+        <w:tc>
+          <w:tcPr>
+            <w:tcW w:type="dxa" w:w="864"/>
+          </w:tcPr>
+          <w:p>
+            <w:pPr>
+              <w:spacing w:after="0" w:line="240" w:lineRule="auto"/>
+              <w:jc w:val="center"/>
+            </w:pPr>
+            <w:r/>
+            <w:r>
+              <w:rPr>
+                <w:sz w:val="18"/>
+              </w:rPr>
+              <w:t>1.51</w:t>
+            </w:r>
+          </w:p>
+        </w:tc>
+        <w:tc>
+          <w:tcPr>
+            <w:tcW w:type="dxa" w:w="1296"/>
+          </w:tcPr>
+          <w:p>
+            <w:pPr>
+              <w:spacing w:after="0" w:line="240" w:lineRule="auto"/>
+              <w:jc w:val="center"/>
+            </w:pPr>
+            <w:r/>
+            <w:r>
+              <w:rPr>
+                <w:sz w:val="18"/>
+              </w:rPr>
+              <w:t>51,784</w:t>
+            </w:r>
+          </w:p>
+        </w:tc>
+        <w:tc>
+          <w:tcPr>
+            <w:tcW w:type="dxa" w:w="864"/>
+          </w:tcPr>
+          <w:p>
+            <w:pPr>
+              <w:spacing w:after="0" w:line="240" w:lineRule="auto"/>
+              <w:jc w:val="center"/>
+            </w:pPr>
+            <w:r/>
+            <w:r>
+              <w:rPr>
+                <w:sz w:val="18"/>
+              </w:rPr>
+              <w:t>7.15</w:t>
+            </w:r>
+          </w:p>
+        </w:tc>
+        <w:tc>
+          <w:tcPr>
+            <w:tcW w:type="dxa" w:w="1296"/>
+          </w:tcPr>
+          <w:p>
+            <w:pPr>
+              <w:spacing w:after="0" w:line="240" w:lineRule="auto"/>
+              <w:jc w:val="center"/>
+            </w:pPr>
+            <w:r/>
+            <w:r>
+              <w:rPr>
+                <w:sz w:val="18"/>
+              </w:rPr>
+              <w:t>10,981</w:t>
+            </w:r>
+          </w:p>
+        </w:tc>
+        <w:tc>
+          <w:tcPr>
+            <w:tcW w:type="dxa" w:w="864"/>
+          </w:tcPr>
+          <w:p>
+            <w:pPr>
+              <w:spacing w:after="0" w:line="240" w:lineRule="auto"/>
+              <w:jc w:val="center"/>
+            </w:pPr>
+            <w:r/>
+            <w:r>
+              <w:rPr>
+                <w:sz w:val="18"/>
+              </w:rPr>
+              <w:t>8.70</w:t>
+            </w:r>
+          </w:p>
+        </w:tc>
+        <w:tc>
+          <w:tcPr>
+            <w:tcW w:type="dxa" w:w="792"/>
+          </w:tcPr>
+          <w:p>
+            <w:pPr>
+              <w:spacing w:after="0" w:line="240" w:lineRule="auto"/>
+              <w:jc w:val="center"/>
+            </w:pPr>
+            <w:r/>
+            <w:r>
+              <w:rPr>
+                <w:sz w:val="18"/>
+              </w:rPr>
+              <w:t>0</w:t>
+            </w:r>
+          </w:p>
+        </w:tc>
+      </w:tr>
+    </w:tbl>
+    <w:p>
+      <w:pPr>
+        <w:spacing w:after="80"/>
+      </w:pPr>
+    </w:p>
+    <w:p>
+      <w:pPr>
+        <w:jc w:val="both"/>
+      </w:pPr>
+      <w:r>
+        <w:t xml:space="preserve">TCP echo throughput rises from 30,103 to 57,474 req/s with 50 clients (1.9×) and from 24,349 to 51,784 req/s with 200 clients (2.1×), and p95 latency at 200 clients falls from 15.90 to 7.15 ms, with 0 errors. Scaling is sub-linear partly because the six load-generator processes compete with the workers for the same 12 cores. </w:t>
+      </w:r>
+      <w:r>
+        <w:rPr>
+          <w:b/>
+        </w:rPr>
+        <w:t>DNS gets worse</w:t>
+      </w:r>
+      <w:r>
+        <w:t xml:space="preserve"> (15,872 → 10,981 q/s): every worker blocks on the </w:t>
+      </w:r>
+      <w:r>
+        <w:rPr>
+          <w:i/>
+        </w:rPr>
+        <w:t>same</w:t>
+      </w:r>
+      <w:r>
+        <w:t xml:space="preserve"> UDP socket, so each datagram wakes several processes (the thundering-herd problem) and work bounces between them, while UDP has no connection to keep a client on one worker. The right design for UDP is one socket per worker with kernel load-balancing (</w:t>
+      </w:r>
+      <w:r>
+        <w:rPr>
+          <w:rFonts w:ascii="Courier New" w:hAnsi="Courier New" w:eastAsia="Courier New"/>
+          <w:sz w:val="21"/>
+        </w:rPr>
+        <w:t>SO_REUSEPORT</w:t>
+      </w:r>
+      <w:r>
+        <w:t xml:space="preserve"> on Linux), which macOS does not provide for this case. The lesson is that the same scaling technique helps a connection-oriented service and hurts a datagram service, so the platform keeps </w:t>
+      </w:r>
+      <w:r>
+        <w:rPr>
+          <w:rFonts w:ascii="Courier New" w:hAnsi="Courier New" w:eastAsia="Courier New"/>
+          <w:sz w:val="21"/>
+        </w:rPr>
+        <w:t>--workers 1</w:t>
+      </w:r>
+      <w:r>
+        <w:t xml:space="preserve"> as the default and documents </w:t>
+      </w:r>
+      <w:r>
+        <w:rPr>
+          <w:rFonts w:ascii="Courier New" w:hAnsi="Courier New" w:eastAsia="Courier New"/>
+          <w:sz w:val="21"/>
+        </w:rPr>
+        <w:t>--workers N</w:t>
+      </w:r>
+      <w:r>
+        <w:t xml:space="preserve"> for TCP-heavy loads. Server statistics are per process in this mode.</w:t>
       </w:r>
     </w:p>
     <w:p>
@@ -20415,7 +21278,7 @@
           <w:b/>
           <w:sz w:val="21"/>
         </w:rPr>
-        <w:t>Table 21:</w:t>
+        <w:t>Table 22:</w:t>
       </w:r>
       <w:r>
         <w:rPr>
@@ -20856,6 +21719,59 @@
                 <w:sz w:val="18"/>
               </w:rPr>
               <w:t>Same success, 4.3–6.7× lower latency (Table 20, Figure 16)</w:t>
+            </w:r>
+          </w:p>
+        </w:tc>
+      </w:tr>
+      <w:tr>
+        <w:tc>
+          <w:tcPr>
+            <w:tcW w:type="dxa" w:w="2398"/>
+          </w:tcPr>
+          <w:p>
+            <w:pPr>
+              <w:spacing w:after="0" w:line="240" w:lineRule="auto"/>
+            </w:pPr>
+            <w:r/>
+            <w:r>
+              <w:rPr>
+                <w:sz w:val="18"/>
+              </w:rPr>
+              <w:t>Pre-fork multi-process mode</w:t>
+            </w:r>
+          </w:p>
+        </w:tc>
+        <w:tc>
+          <w:tcPr>
+            <w:tcW w:type="dxa" w:w="3809"/>
+          </w:tcPr>
+          <w:p>
+            <w:pPr>
+              <w:spacing w:after="0" w:line="240" w:lineRule="auto"/>
+            </w:pPr>
+            <w:r/>
+            <w:r>
+              <w:rPr>
+                <w:sz w:val="18"/>
+              </w:rPr>
+              <w:t>Shared listening sockets across processes break the one-core GIL ceiling for TCP; the UDP regression is measured and explained</w:t>
+            </w:r>
+          </w:p>
+        </w:tc>
+        <w:tc>
+          <w:tcPr>
+            <w:tcW w:type="dxa" w:w="2821"/>
+          </w:tcPr>
+          <w:p>
+            <w:pPr>
+              <w:spacing w:after="0" w:line="240" w:lineRule="auto"/>
+            </w:pPr>
+            <w:r/>
+            <w:r>
+              <w:rPr>
+                <w:sz w:val="18"/>
+              </w:rPr>
+              <w:t>Echo 1.9–2.1× throughput (Table 21)</w:t>
             </w:r>
           </w:p>
         </w:tc>
@@ -21054,7 +21970,17 @@
         <w:jc w:val="both"/>
       </w:pPr>
       <w:r>
-        <w:t>The thread-per-connection design is bounded by the interpreter’s single-core execution (≈29k echo requests/s) and by thread and memory limits (≈54 KB per connection; ≈4,000 threads per process on this macOS machine).</w:t>
+        <w:t xml:space="preserve">A single server process is bounded by the interpreter’s single-core execution (≈29k echo requests/s); </w:t>
+      </w:r>
+      <w:r>
+        <w:rPr>
+          <w:rFonts w:ascii="Courier New" w:hAnsi="Courier New" w:eastAsia="Courier New"/>
+          <w:sz w:val="21"/>
+        </w:rPr>
+        <w:t>--workers N</w:t>
+      </w:r>
+      <w:r>
+        <w:t xml:space="preserve"> lifts this for TCP but slows the shared-socket UDP services. Thread and memory limits also apply (≈54 KB per connection; ≈4,000 threads per process on this macOS machine).</w:t>
       </w:r>
     </w:p>
     <w:p>

</xml_diff>

<commit_message>
Make delay-emulation test robust on loaded CI runners; run all CI platforms
</commit_message>
<xml_diff>
--- a/report/CN_Project_Report.docx
+++ b/report/CN_Project_Report.docx
@@ -7014,7 +7014,7 @@
         <w:t>52 passed, 0 failed, 0 errors, 0 skipped</w:t>
       </w:r>
       <w:r>
-        <w:t xml:space="preserve"> in 17.32 s (</w:t>
+        <w:t xml:space="preserve"> in 17.54 s (</w:t>
       </w:r>
       <w:r>
         <w:rPr>
@@ -10609,7 +10609,7 @@
               <w:rPr>
                 <w:sz w:val="17"/>
               </w:rPr>
-              <w:t>With 20 ms emulated delay the measured RTT is ~20 ms and the adaptive RTO settles above it.</w:t>
+              <w:t>With 20 ms emulated delay every RTT exceeds 17 ms, SRTT tracks the measured RTT and the RTO settles above it.</w:t>
             </w:r>
           </w:p>
         </w:tc>
@@ -11717,7 +11717,7 @@
       <w:r>
         <w:drawing>
           <wp:inline xmlns:a="http://schemas.openxmlformats.org/drawingml/2006/main" xmlns:pic="http://schemas.openxmlformats.org/drawingml/2006/picture">
-            <wp:extent cx="5733288" cy="7577955"/>
+            <wp:extent cx="5733288" cy="7091298"/>
             <wp:docPr id="10" name="Picture 10"/>
             <wp:cNvGraphicFramePr>
               <a:graphicFrameLocks noChangeAspect="1"/>
@@ -11738,7 +11738,7 @@
                   <pic:spPr>
                     <a:xfrm>
                       <a:off x="0" y="0"/>
-                      <a:ext cx="5733288" cy="7577955"/>
+                      <a:ext cx="5733288" cy="7091298"/>
                     </a:xfrm>
                     <a:prstGeom prst="rect"/>
                   </pic:spPr>

</xml_diff>